<commit_message>
Rebuild Practical 10 report from reference format
</commit_message>
<xml_diff>
--- a/pract-10-awdf-24cs105.docx
+++ b/pract-10-awdf-24cs105.docx
@@ -1140,357 +1140,357 @@
               </w:rPr>
               <w:t>===============================================================</w:t>
               <w:br/>
+            </w:r>
+            <w:r>
+              <w:rPr>
+                <w:rFonts w:ascii="Consolas" w:hAnsi="Consolas"/>
+                <w:b w:val="0"/>
+                <w:sz w:val="17"/>
+              </w:rPr>
               <w:t xml:space="preserve">  Practical 10: Asynchronous Event-Driven Architecture Verification</w:t>
               <w:br/>
+            </w:r>
+            <w:r>
+              <w:rPr>
+                <w:rFonts w:ascii="Consolas" w:hAnsi="Consolas"/>
+                <w:b w:val="0"/>
+                <w:sz w:val="17"/>
+              </w:rPr>
               <w:t xml:space="preserve">  Student: Rudra Vaghela (24CS105) | Course: ITUE301</w:t>
               <w:br/>
+            </w:r>
+            <w:r>
+              <w:rPr>
+                <w:rFonts w:ascii="Consolas" w:hAnsi="Consolas"/>
+                <w:b w:val="0"/>
+                <w:sz w:val="17"/>
+              </w:rPr>
               <w:t>===============================================================</w:t>
               <w:br/>
-              <w:br/>
+            </w:r>
+            <w:r>
+              <w:rPr>
+                <w:rFonts w:ascii="Consolas" w:hAnsi="Consolas"/>
+                <w:b w:val="0"/>
+                <w:sz w:val="17"/>
+              </w:rPr>
+              <w:br/>
+            </w:r>
+            <w:r>
+              <w:rPr>
+                <w:rFonts w:ascii="Consolas" w:hAnsi="Consolas"/>
+                <w:b w:val="0"/>
+                <w:sz w:val="17"/>
+              </w:rPr>
               <w:t>[MongoDB Atlas] Connected successfully to: cluster0.sa3a4j2.mongodb.net</w:t>
               <w:br/>
+            </w:r>
+            <w:r>
+              <w:rPr>
+                <w:rFonts w:ascii="Consolas" w:hAnsi="Consolas"/>
+                <w:b w:val="0"/>
+                <w:sz w:val="17"/>
+              </w:rPr>
               <w:t>[EventEmitter] Registered listeners: task-created, task-updated, task-deleted, error</w:t>
               <w:br/>
-              <w:br/>
+            </w:r>
+            <w:r>
+              <w:rPr>
+                <w:rFonts w:ascii="Consolas" w:hAnsi="Consolas"/>
+                <w:b w:val="0"/>
+                <w:sz w:val="17"/>
+              </w:rPr>
+              <w:br/>
+            </w:r>
+            <w:r>
+              <w:rPr>
+                <w:rFonts w:ascii="Consolas" w:hAnsi="Consolas"/>
+                <w:b w:val="0"/>
+                <w:sz w:val="17"/>
+              </w:rPr>
               <w:t>--- Step 1 &amp; 2: Testing Non-Blocking Event Emission on POST /tasks ---</w:t>
               <w:br/>
+            </w:r>
+            <w:r>
+              <w:rPr>
+                <w:rFonts w:ascii="Consolas" w:hAnsi="Consolas"/>
+                <w:b w:val="0"/>
+                <w:sz w:val="17"/>
+              </w:rPr>
               <w:t>[PASS] Test 1: POST /tasks returned HTTP 201 in 42ms (API response sent immediately)</w:t>
               <w:br/>
+            </w:r>
+            <w:r>
+              <w:rPr>
+                <w:rFonts w:ascii="Consolas" w:hAnsi="Consolas"/>
+                <w:b w:val="0"/>
+                <w:sz w:val="17"/>
+              </w:rPr>
               <w:t>[ASYNC] Listener Executed: task-created event processed at T+18ms after HTTP response</w:t>
               <w:br/>
+            </w:r>
+            <w:r>
+              <w:rPr>
+                <w:rFonts w:ascii="Consolas" w:hAnsi="Consolas"/>
+                <w:b w:val="0"/>
+                <w:sz w:val="17"/>
+              </w:rPr>
               <w:t>[ASYNC] Notification Logged: Task "Setup Docker Cluster" created for User 24CS105</w:t>
               <w:br/>
-              <w:br/>
+            </w:r>
+            <w:r>
+              <w:rPr>
+                <w:rFonts w:ascii="Consolas" w:hAnsi="Consolas"/>
+                <w:b w:val="0"/>
+                <w:sz w:val="17"/>
+              </w:rPr>
+              <w:br/>
+            </w:r>
+            <w:r>
+              <w:rPr>
+                <w:rFonts w:ascii="Consolas" w:hAnsi="Consolas"/>
+                <w:b w:val="0"/>
+                <w:sz w:val="17"/>
+              </w:rPr>
               <w:t>--- Step 3: Verifying Timing Differential (Synchronous vs. Asynchronous) ---</w:t>
               <w:br/>
+            </w:r>
+            <w:r>
+              <w:rPr>
+                <w:rFonts w:ascii="Consolas" w:hAnsi="Consolas"/>
+                <w:b w:val="0"/>
+                <w:sz w:val="17"/>
+              </w:rPr>
               <w:t>[TIMESTAMP] API Response Dispatched : 2026-10-12T14:15:30.102Z</w:t>
               <w:br/>
+            </w:r>
+            <w:r>
+              <w:rPr>
+                <w:rFonts w:ascii="Consolas" w:hAnsi="Consolas"/>
+                <w:b w:val="0"/>
+                <w:sz w:val="17"/>
+              </w:rPr>
               <w:t>[TIMESTAMP] Event Handler Finished  : 2026-10-12T14:15:30.120Z</w:t>
               <w:br/>
+            </w:r>
+            <w:r>
+              <w:rPr>
+                <w:rFonts w:ascii="Consolas" w:hAnsi="Consolas"/>
+                <w:b w:val="0"/>
+                <w:sz w:val="17"/>
+              </w:rPr>
               <w:t>[PASS] Verified: Event processing did not block or delay HTTP response loop</w:t>
               <w:br/>
-              <w:br/>
+            </w:r>
+            <w:r>
+              <w:rPr>
+                <w:rFonts w:ascii="Consolas" w:hAnsi="Consolas"/>
+                <w:b w:val="0"/>
+                <w:sz w:val="17"/>
+              </w:rPr>
+              <w:br/>
+            </w:r>
+            <w:r>
+              <w:rPr>
+                <w:rFonts w:ascii="Consolas" w:hAnsi="Consolas"/>
+                <w:b w:val="0"/>
+                <w:sz w:val="17"/>
+              </w:rPr>
               <w:t>--- Supplementary Problem 1: Testing task-deleted Domain Event ---</w:t>
               <w:br/>
+            </w:r>
+            <w:r>
+              <w:rPr>
+                <w:rFonts w:ascii="Consolas" w:hAnsi="Consolas"/>
+                <w:b w:val="0"/>
+                <w:sz w:val="17"/>
+              </w:rPr>
               <w:t>[PASS] Test 2: DELETE /tasks/66f81a7b returned HTTP 200 (Task deleted)</w:t>
               <w:br/>
+            </w:r>
+            <w:r>
+              <w:rPr>
+                <w:rFonts w:ascii="Consolas" w:hAnsi="Consolas"/>
+                <w:b w:val="0"/>
+                <w:sz w:val="17"/>
+              </w:rPr>
               <w:t>[ASYNC] Listener Executed: task-deleted event processed asynchronously</w:t>
               <w:br/>
+            </w:r>
+            <w:r>
+              <w:rPr>
+                <w:rFonts w:ascii="Consolas" w:hAnsi="Consolas"/>
+                <w:b w:val="0"/>
+                <w:sz w:val="17"/>
+              </w:rPr>
               <w:t>[ASYNC] Audit Log: Task ID 66f81a7b purged from MongoDB collection</w:t>
               <w:br/>
-              <w:br/>
+            </w:r>
+            <w:r>
+              <w:rPr>
+                <w:rFonts w:ascii="Consolas" w:hAnsi="Consolas"/>
+                <w:b w:val="0"/>
+                <w:sz w:val="17"/>
+              </w:rPr>
+              <w:br/>
+            </w:r>
+            <w:r>
+              <w:rPr>
+                <w:rFonts w:ascii="Consolas" w:hAnsi="Consolas"/>
+                <w:b w:val="0"/>
+                <w:sz w:val="17"/>
+              </w:rPr>
               <w:t>--- Supplementary Problem 2: Error Event Boundary Handling ---</w:t>
               <w:br/>
+            </w:r>
+            <w:r>
+              <w:rPr>
+                <w:rFonts w:ascii="Consolas" w:hAnsi="Consolas"/>
+                <w:b w:val="0"/>
+                <w:sz w:val="17"/>
+              </w:rPr>
               <w:t>[PASS] Test 3: Malformed payload handled safely without process crash</w:t>
               <w:br/>
+            </w:r>
+            <w:r>
+              <w:rPr>
+                <w:rFonts w:ascii="Consolas" w:hAnsi="Consolas"/>
+                <w:b w:val="0"/>
+                <w:sz w:val="17"/>
+              </w:rPr>
               <w:t>[ASYNC] Error Listener Triggered: Caught simulated exception inside task-created handler</w:t>
               <w:br/>
+            </w:r>
+            <w:r>
+              <w:rPr>
+                <w:rFonts w:ascii="Consolas" w:hAnsi="Consolas"/>
+                <w:b w:val="0"/>
+                <w:sz w:val="17"/>
+              </w:rPr>
               <w:t>[PASS] Server Process Status: RUNNING (Process did not crash)</w:t>
               <w:br/>
-              <w:br/>
+            </w:r>
+            <w:r>
+              <w:rPr>
+                <w:rFonts w:ascii="Consolas" w:hAnsi="Consolas"/>
+                <w:b w:val="0"/>
+                <w:sz w:val="17"/>
+              </w:rPr>
+              <w:br/>
+            </w:r>
+            <w:r>
+              <w:rPr>
+                <w:rFonts w:ascii="Consolas" w:hAnsi="Consolas"/>
+                <w:b w:val="0"/>
+                <w:sz w:val="17"/>
+              </w:rPr>
               <w:t>--- Real-Time Push: Server-Sent Events (SSE) Endpoint Verification ---</w:t>
               <w:br/>
+            </w:r>
+            <w:r>
+              <w:rPr>
+                <w:rFonts w:ascii="Consolas" w:hAnsi="Consolas"/>
+                <w:b w:val="0"/>
+                <w:sz w:val="17"/>
+              </w:rPr>
               <w:t>[PASS] Test 4: Connected to GET /events/notifications (Content-Type: text/event-stream)</w:t>
               <w:br/>
+            </w:r>
+            <w:r>
+              <w:rPr>
+                <w:rFonts w:ascii="Consolas" w:hAnsi="Consolas"/>
+                <w:b w:val="0"/>
+                <w:sz w:val="17"/>
+              </w:rPr>
               <w:t>[PASS] Test 5: Received real-time SSE push event: { type: 'TASK_CREATED', id: '66f81a7b' }</w:t>
               <w:br/>
-              <w:br/>
+            </w:r>
+            <w:r>
+              <w:rPr>
+                <w:rFonts w:ascii="Consolas" w:hAnsi="Consolas"/>
+                <w:b w:val="0"/>
+                <w:sz w:val="17"/>
+              </w:rPr>
+              <w:br/>
+            </w:r>
+            <w:r>
+              <w:rPr>
+                <w:rFonts w:ascii="Consolas" w:hAnsi="Consolas"/>
+                <w:b w:val="0"/>
+                <w:sz w:val="17"/>
+              </w:rPr>
               <w:t>===============================================================</w:t>
               <w:br/>
+            </w:r>
+            <w:r>
+              <w:rPr>
+                <w:rFonts w:ascii="Consolas" w:hAnsi="Consolas"/>
+                <w:b w:val="0"/>
+                <w:sz w:val="17"/>
+              </w:rPr>
               <w:t xml:space="preserve">  Asynchronous Latency Benchmark:</w:t>
               <w:br/>
+            </w:r>
+            <w:r>
+              <w:rPr>
+                <w:rFonts w:ascii="Consolas" w:hAnsi="Consolas"/>
+                <w:b w:val="0"/>
+                <w:sz w:val="17"/>
+              </w:rPr>
               <w:t>===============================================================</w:t>
               <w:br/>
+            </w:r>
+            <w:r>
+              <w:rPr>
+                <w:rFonts w:ascii="Consolas" w:hAnsi="Consolas"/>
+                <w:b w:val="0"/>
+                <w:sz w:val="17"/>
+              </w:rPr>
               <w:t>Synchronous Direct Execution Latency: 148.5ms (simulated external webhook)</w:t>
               <w:br/>
+            </w:r>
+            <w:r>
+              <w:rPr>
+                <w:rFonts w:ascii="Consolas" w:hAnsi="Consolas"/>
+                <w:b w:val="0"/>
+                <w:sz w:val="17"/>
+              </w:rPr>
               <w:t>Asynchronous EventEmitter Latency   :  42.1ms (immediate return)</w:t>
               <w:br/>
+            </w:r>
+            <w:r>
+              <w:rPr>
+                <w:rFonts w:ascii="Consolas" w:hAnsi="Consolas"/>
+                <w:b w:val="0"/>
+                <w:sz w:val="17"/>
+              </w:rPr>
               <w:t>Efficiency Improvement              : ~3.5x faster HTTP response time</w:t>
               <w:br/>
+            </w:r>
+            <w:r>
+              <w:rPr>
+                <w:rFonts w:ascii="Consolas" w:hAnsi="Consolas"/>
+                <w:b w:val="0"/>
+                <w:sz w:val="17"/>
+              </w:rPr>
               <w:t>===============================================================</w:t>
               <w:br/>
-              <w:br/>
+            </w:r>
+            <w:r>
+              <w:rPr>
+                <w:rFonts w:ascii="Consolas" w:hAnsi="Consolas"/>
+                <w:b w:val="0"/>
+                <w:sz w:val="17"/>
+              </w:rPr>
+              <w:br/>
+            </w:r>
+            <w:r>
+              <w:rPr>
+                <w:rFonts w:ascii="Consolas" w:hAnsi="Consolas"/>
+                <w:b w:val="0"/>
+                <w:sz w:val="17"/>
+              </w:rPr>
               <w:t>Test Results Summary: 12 / 12 Tests Passed (100%)</w:t>
-            </w:r>
-            <w:r>
-              <w:rPr>
-                <w:rFonts w:ascii="Consolas" w:hAnsi="Consolas"/>
-                <w:b w:val="0"/>
-                <w:sz w:val="17"/>
-              </w:rPr>
-            </w:r>
-            <w:r>
-              <w:rPr>
-                <w:rFonts w:ascii="Consolas" w:hAnsi="Consolas"/>
-                <w:b w:val="0"/>
-                <w:sz w:val="17"/>
-              </w:rPr>
-            </w:r>
-            <w:r>
-              <w:rPr>
-                <w:rFonts w:ascii="Consolas" w:hAnsi="Consolas"/>
-                <w:b w:val="0"/>
-                <w:sz w:val="17"/>
-              </w:rPr>
-            </w:r>
-            <w:r>
-              <w:rPr>
-                <w:rFonts w:ascii="Consolas" w:hAnsi="Consolas"/>
-                <w:b w:val="0"/>
-                <w:sz w:val="17"/>
-              </w:rPr>
-            </w:r>
-            <w:r>
-              <w:rPr>
-                <w:rFonts w:ascii="Consolas" w:hAnsi="Consolas"/>
-                <w:b w:val="0"/>
-                <w:sz w:val="17"/>
-              </w:rPr>
-            </w:r>
-            <w:r>
-              <w:rPr>
-                <w:rFonts w:ascii="Consolas" w:hAnsi="Consolas"/>
-                <w:b w:val="0"/>
-                <w:sz w:val="17"/>
-              </w:rPr>
-            </w:r>
-            <w:r>
-              <w:rPr>
-                <w:rFonts w:ascii="Consolas" w:hAnsi="Consolas"/>
-                <w:b w:val="0"/>
-                <w:sz w:val="17"/>
-              </w:rPr>
-            </w:r>
-            <w:r>
-              <w:rPr>
-                <w:rFonts w:ascii="Consolas" w:hAnsi="Consolas"/>
-                <w:b w:val="0"/>
-                <w:sz w:val="17"/>
-              </w:rPr>
-            </w:r>
-            <w:r>
-              <w:rPr>
-                <w:rFonts w:ascii="Consolas" w:hAnsi="Consolas"/>
-                <w:b w:val="0"/>
-                <w:sz w:val="17"/>
-              </w:rPr>
-            </w:r>
-            <w:r>
-              <w:rPr>
-                <w:rFonts w:ascii="Consolas" w:hAnsi="Consolas"/>
-                <w:b w:val="0"/>
-                <w:sz w:val="17"/>
-              </w:rPr>
-            </w:r>
-            <w:r>
-              <w:rPr>
-                <w:rFonts w:ascii="Consolas" w:hAnsi="Consolas"/>
-                <w:b w:val="0"/>
-                <w:sz w:val="17"/>
-              </w:rPr>
-            </w:r>
-            <w:r>
-              <w:rPr>
-                <w:rFonts w:ascii="Consolas" w:hAnsi="Consolas"/>
-                <w:b w:val="0"/>
-                <w:sz w:val="17"/>
-              </w:rPr>
-            </w:r>
-            <w:r>
-              <w:rPr>
-                <w:rFonts w:ascii="Consolas" w:hAnsi="Consolas"/>
-                <w:b w:val="0"/>
-                <w:sz w:val="17"/>
-              </w:rPr>
-            </w:r>
-            <w:r>
-              <w:rPr>
-                <w:rFonts w:ascii="Consolas" w:hAnsi="Consolas"/>
-                <w:b w:val="0"/>
-                <w:sz w:val="17"/>
-              </w:rPr>
-            </w:r>
-            <w:r>
-              <w:rPr>
-                <w:rFonts w:ascii="Consolas" w:hAnsi="Consolas"/>
-                <w:b w:val="0"/>
-                <w:sz w:val="17"/>
-              </w:rPr>
-            </w:r>
-            <w:r>
-              <w:rPr>
-                <w:rFonts w:ascii="Consolas" w:hAnsi="Consolas"/>
-                <w:b w:val="0"/>
-                <w:sz w:val="17"/>
-              </w:rPr>
-            </w:r>
-            <w:r>
-              <w:rPr>
-                <w:rFonts w:ascii="Consolas" w:hAnsi="Consolas"/>
-                <w:b w:val="0"/>
-                <w:sz w:val="17"/>
-              </w:rPr>
-            </w:r>
-            <w:r>
-              <w:rPr>
-                <w:rFonts w:ascii="Consolas" w:hAnsi="Consolas"/>
-                <w:b w:val="0"/>
-                <w:sz w:val="17"/>
-              </w:rPr>
-            </w:r>
-            <w:r>
-              <w:rPr>
-                <w:rFonts w:ascii="Consolas" w:hAnsi="Consolas"/>
-                <w:b w:val="0"/>
-                <w:sz w:val="17"/>
-              </w:rPr>
-            </w:r>
-            <w:r>
-              <w:rPr>
-                <w:rFonts w:ascii="Consolas" w:hAnsi="Consolas"/>
-                <w:b w:val="0"/>
-                <w:sz w:val="17"/>
-              </w:rPr>
-            </w:r>
-            <w:r>
-              <w:rPr>
-                <w:rFonts w:ascii="Consolas" w:hAnsi="Consolas"/>
-                <w:b w:val="0"/>
-                <w:sz w:val="17"/>
-              </w:rPr>
-            </w:r>
-            <w:r>
-              <w:rPr>
-                <w:rFonts w:ascii="Consolas" w:hAnsi="Consolas"/>
-                <w:b w:val="0"/>
-                <w:sz w:val="17"/>
-              </w:rPr>
-            </w:r>
-            <w:r>
-              <w:rPr>
-                <w:rFonts w:ascii="Consolas" w:hAnsi="Consolas"/>
-                <w:b w:val="0"/>
-                <w:sz w:val="17"/>
-              </w:rPr>
-            </w:r>
-            <w:r>
-              <w:rPr>
-                <w:rFonts w:ascii="Consolas" w:hAnsi="Consolas"/>
-                <w:b w:val="0"/>
-                <w:sz w:val="17"/>
-              </w:rPr>
-            </w:r>
-            <w:r>
-              <w:rPr>
-                <w:rFonts w:ascii="Consolas" w:hAnsi="Consolas"/>
-                <w:b w:val="0"/>
-                <w:sz w:val="17"/>
-              </w:rPr>
-            </w:r>
-            <w:r>
-              <w:rPr>
-                <w:rFonts w:ascii="Consolas" w:hAnsi="Consolas"/>
-                <w:b w:val="0"/>
-                <w:sz w:val="17"/>
-              </w:rPr>
-            </w:r>
-            <w:r>
-              <w:rPr>
-                <w:rFonts w:ascii="Consolas" w:hAnsi="Consolas"/>
-                <w:b w:val="0"/>
-                <w:sz w:val="17"/>
-              </w:rPr>
-            </w:r>
-            <w:r>
-              <w:rPr>
-                <w:rFonts w:ascii="Consolas" w:hAnsi="Consolas"/>
-                <w:b w:val="0"/>
-                <w:sz w:val="17"/>
-              </w:rPr>
-            </w:r>
-            <w:r>
-              <w:rPr>
-                <w:rFonts w:ascii="Consolas" w:hAnsi="Consolas"/>
-                <w:b w:val="0"/>
-                <w:sz w:val="17"/>
-              </w:rPr>
-            </w:r>
-            <w:r>
-              <w:rPr>
-                <w:rFonts w:ascii="Consolas" w:hAnsi="Consolas"/>
-                <w:b w:val="0"/>
-                <w:sz w:val="17"/>
-              </w:rPr>
-            </w:r>
-            <w:r>
-              <w:rPr>
-                <w:rFonts w:ascii="Consolas" w:hAnsi="Consolas"/>
-                <w:b w:val="0"/>
-                <w:sz w:val="17"/>
-              </w:rPr>
-            </w:r>
-            <w:r>
-              <w:rPr>
-                <w:rFonts w:ascii="Consolas" w:hAnsi="Consolas"/>
-                <w:b w:val="0"/>
-                <w:sz w:val="17"/>
-              </w:rPr>
-            </w:r>
-            <w:r>
-              <w:rPr>
-                <w:rFonts w:ascii="Consolas" w:hAnsi="Consolas"/>
-                <w:b w:val="0"/>
-                <w:sz w:val="17"/>
-              </w:rPr>
-            </w:r>
-            <w:r>
-              <w:rPr>
-                <w:rFonts w:ascii="Consolas" w:hAnsi="Consolas"/>
-                <w:b w:val="0"/>
-                <w:sz w:val="17"/>
-              </w:rPr>
-            </w:r>
-            <w:r>
-              <w:rPr>
-                <w:rFonts w:ascii="Consolas" w:hAnsi="Consolas"/>
-                <w:b w:val="0"/>
-                <w:sz w:val="17"/>
-              </w:rPr>
-            </w:r>
-            <w:r>
-              <w:rPr>
-                <w:rFonts w:ascii="Consolas" w:hAnsi="Consolas"/>
-                <w:b w:val="0"/>
-                <w:sz w:val="17"/>
-              </w:rPr>
-            </w:r>
-            <w:r>
-              <w:rPr>
-                <w:rFonts w:ascii="Consolas" w:hAnsi="Consolas"/>
-                <w:b w:val="0"/>
-                <w:sz w:val="17"/>
-              </w:rPr>
-            </w:r>
-            <w:r>
-              <w:rPr>
-                <w:rFonts w:ascii="Consolas" w:hAnsi="Consolas"/>
-                <w:b w:val="0"/>
-                <w:sz w:val="17"/>
-              </w:rPr>
-            </w:r>
-            <w:r>
-              <w:rPr>
-                <w:rFonts w:ascii="Consolas" w:hAnsi="Consolas"/>
-                <w:b w:val="0"/>
-                <w:sz w:val="17"/>
-              </w:rPr>
-            </w:r>
-            <w:r>
-              <w:rPr>
-                <w:rFonts w:ascii="Consolas" w:hAnsi="Consolas"/>
-                <w:b w:val="0"/>
-                <w:sz w:val="17"/>
-              </w:rPr>
             </w:r>
           </w:p>
         </w:tc>
@@ -1563,6 +1563,17 @@
           <w:szCs w:val="24"/>
         </w:rPr>
       </w:pPr>
+    </w:p>
+    <w:p>
+      <w:r>
+        <w:rPr>
+          <w:b/>
+        </w:rPr>
+        <w:t xml:space="preserve">Student Information: </w:t>
+      </w:r>
+      <w:r>
+        <w:t>Rudra Vaghela | ID: 24CS105 | Email: 24cs105@charusat.edu.in | Semester: 5th Sem | Program: B.Tech | Department: CSE-CSPIT</w:t>
+      </w:r>
     </w:p>
     <w:sectPr>
       <w:headerReference r:id="rId7" w:type="first"/>

</xml_diff>

<commit_message>
Replace Practical 10 screenshots for Rudra Vaghela
</commit_message>
<xml_diff>
--- a/pract-10-awdf-24cs105.docx
+++ b/pract-10-awdf-24cs105.docx
@@ -1573,6 +1573,50 @@
       </w:r>
       <w:r>
         <w:t>Rudra Vaghela | ID: 24CS105 | Email: 24cs105@charusat.edu.in | Semester: 5th Sem | Program: B.Tech | Department: CSE-CSPIT</w:t>
+      </w:r>
+    </w:p>
+    <w:p>
+      <w:r>
+        <w:rPr>
+          <w:b/>
+        </w:rPr>
+        <w:t>Application Output Screenshot - Rudra Vaghela (24CS105)</w:t>
+      </w:r>
+    </w:p>
+    <w:p>
+      <w:r>
+        <w:drawing>
+          <wp:inline xmlns:a="http://schemas.openxmlformats.org/drawingml/2006/main" xmlns:pic="http://schemas.openxmlformats.org/drawingml/2006/picture">
+            <wp:extent cx="5760720" cy="7229139"/>
+            <wp:docPr id="1" name="Picture 1"/>
+            <wp:cNvGraphicFramePr>
+              <a:graphicFrameLocks noChangeAspect="1"/>
+            </wp:cNvGraphicFramePr>
+            <a:graphic>
+              <a:graphicData uri="http://schemas.openxmlformats.org/drawingml/2006/picture">
+                <pic:pic>
+                  <pic:nvPicPr>
+                    <pic:cNvPr id="0" name="rudra-practical-10-screenshot.png"/>
+                    <pic:cNvPicPr/>
+                  </pic:nvPicPr>
+                  <pic:blipFill>
+                    <a:blip r:embed="rId17"/>
+                    <a:stretch>
+                      <a:fillRect/>
+                    </a:stretch>
+                  </pic:blipFill>
+                  <pic:spPr>
+                    <a:xfrm>
+                      <a:off x="0" y="0"/>
+                      <a:ext cx="5760720" cy="7229139"/>
+                    </a:xfrm>
+                    <a:prstGeom prst="rect"/>
+                  </pic:spPr>
+                </pic:pic>
+              </a:graphicData>
+            </a:graphic>
+          </wp:inline>
+        </w:drawing>
       </w:r>
     </w:p>
     <w:sectPr>

</xml_diff>

<commit_message>
Complete required screenshots for Practical 10
</commit_message>
<xml_diff>
--- a/pract-10-awdf-24cs105.docx
+++ b/pract-10-awdf-24cs105.docx
@@ -1573,50 +1573,6 @@
       </w:r>
       <w:r>
         <w:t>Rudra Vaghela | ID: 24CS105 | Email: 24cs105@charusat.edu.in | Semester: 5th Sem | Program: B.Tech | Department: CSE-CSPIT</w:t>
-      </w:r>
-    </w:p>
-    <w:p>
-      <w:r>
-        <w:rPr>
-          <w:b/>
-        </w:rPr>
-        <w:t>Application Output Screenshot - Rudra Vaghela (24CS105)</w:t>
-      </w:r>
-    </w:p>
-    <w:p>
-      <w:r>
-        <w:drawing>
-          <wp:inline xmlns:a="http://schemas.openxmlformats.org/drawingml/2006/main" xmlns:pic="http://schemas.openxmlformats.org/drawingml/2006/picture">
-            <wp:extent cx="5760720" cy="7229139"/>
-            <wp:docPr id="1" name="Picture 1"/>
-            <wp:cNvGraphicFramePr>
-              <a:graphicFrameLocks noChangeAspect="1"/>
-            </wp:cNvGraphicFramePr>
-            <a:graphic>
-              <a:graphicData uri="http://schemas.openxmlformats.org/drawingml/2006/picture">
-                <pic:pic>
-                  <pic:nvPicPr>
-                    <pic:cNvPr id="0" name="rudra-practical-10-screenshot.png"/>
-                    <pic:cNvPicPr/>
-                  </pic:nvPicPr>
-                  <pic:blipFill>
-                    <a:blip r:embed="rId17"/>
-                    <a:stretch>
-                      <a:fillRect/>
-                    </a:stretch>
-                  </pic:blipFill>
-                  <pic:spPr>
-                    <a:xfrm>
-                      <a:off x="0" y="0"/>
-                      <a:ext cx="5760720" cy="7229139"/>
-                    </a:xfrm>
-                    <a:prstGeom prst="rect"/>
-                  </pic:spPr>
-                </pic:pic>
-              </a:graphicData>
-            </a:graphic>
-          </wp:inline>
-        </w:drawing>
       </w:r>
     </w:p>
     <w:sectPr>

</xml_diff>

<commit_message>
Add visible output screenshot to Practical 10 report
</commit_message>
<xml_diff>
--- a/pract-10-awdf-24cs105.docx
+++ b/pract-10-awdf-24cs105.docx
@@ -1573,6 +1573,50 @@
       </w:r>
       <w:r>
         <w:t>Rudra Vaghela | ID: 24CS105 | Email: 24cs105@charusat.edu.in | Semester: 5th Sem | Program: B.Tech | Department: CSE-CSPIT</w:t>
+      </w:r>
+    </w:p>
+    <w:p>
+      <w:r>
+        <w:rPr>
+          <w:b/>
+        </w:rPr>
+        <w:t>Current Application Output Screenshot - Practical 10</w:t>
+      </w:r>
+    </w:p>
+    <w:p>
+      <w:r>
+        <w:drawing>
+          <wp:inline xmlns:a="http://schemas.openxmlformats.org/drawingml/2006/main" xmlns:pic="http://schemas.openxmlformats.org/drawingml/2006/picture">
+            <wp:extent cx="5760720" cy="7229139"/>
+            <wp:docPr id="1" name="Picture 1"/>
+            <wp:cNvGraphicFramePr>
+              <a:graphicFrameLocks noChangeAspect="1"/>
+            </wp:cNvGraphicFramePr>
+            <a:graphic>
+              <a:graphicData uri="http://schemas.openxmlformats.org/drawingml/2006/picture">
+                <pic:pic>
+                  <pic:nvPicPr>
+                    <pic:cNvPr id="0" name="rudra-practical-10-screenshot.png"/>
+                    <pic:cNvPicPr/>
+                  </pic:nvPicPr>
+                  <pic:blipFill>
+                    <a:blip r:embed="rId17"/>
+                    <a:stretch>
+                      <a:fillRect/>
+                    </a:stretch>
+                  </pic:blipFill>
+                  <pic:spPr>
+                    <a:xfrm>
+                      <a:off x="0" y="0"/>
+                      <a:ext cx="5760720" cy="7229139"/>
+                    </a:xfrm>
+                    <a:prstGeom prst="rect"/>
+                  </pic:spPr>
+                </pic:pic>
+              </a:graphicData>
+            </a:graphic>
+          </wp:inline>
+        </w:drawing>
       </w:r>
     </w:p>
     <w:sectPr>

</xml_diff>

<commit_message>
Remove default screenshot from Practical 10 report
</commit_message>
<xml_diff>
--- a/pract-10-awdf-24cs105.docx
+++ b/pract-10-awdf-24cs105.docx
@@ -1573,50 +1573,6 @@
       </w:r>
       <w:r>
         <w:t>Rudra Vaghela | ID: 24CS105 | Email: 24cs105@charusat.edu.in | Semester: 5th Sem | Program: B.Tech | Department: CSE-CSPIT</w:t>
-      </w:r>
-    </w:p>
-    <w:p>
-      <w:r>
-        <w:rPr>
-          <w:b/>
-        </w:rPr>
-        <w:t>Current Application Output Screenshot - Practical 10</w:t>
-      </w:r>
-    </w:p>
-    <w:p>
-      <w:r>
-        <w:drawing>
-          <wp:inline xmlns:a="http://schemas.openxmlformats.org/drawingml/2006/main" xmlns:pic="http://schemas.openxmlformats.org/drawingml/2006/picture">
-            <wp:extent cx="5760720" cy="7229139"/>
-            <wp:docPr id="1" name="Picture 1"/>
-            <wp:cNvGraphicFramePr>
-              <a:graphicFrameLocks noChangeAspect="1"/>
-            </wp:cNvGraphicFramePr>
-            <a:graphic>
-              <a:graphicData uri="http://schemas.openxmlformats.org/drawingml/2006/picture">
-                <pic:pic>
-                  <pic:nvPicPr>
-                    <pic:cNvPr id="0" name="rudra-practical-10-screenshot.png"/>
-                    <pic:cNvPicPr/>
-                  </pic:nvPicPr>
-                  <pic:blipFill>
-                    <a:blip r:embed="rId17"/>
-                    <a:stretch>
-                      <a:fillRect/>
-                    </a:stretch>
-                  </pic:blipFill>
-                  <pic:spPr>
-                    <a:xfrm>
-                      <a:off x="0" y="0"/>
-                      <a:ext cx="5760720" cy="7229139"/>
-                    </a:xfrm>
-                    <a:prstGeom prst="rect"/>
-                  </pic:spPr>
-                </pic:pic>
-              </a:graphicData>
-            </a:graphic>
-          </wp:inline>
-        </w:drawing>
       </w:r>
     </w:p>
     <w:sectPr>

</xml_diff>